<commit_message>
Add patent constraint graph update
</commit_message>
<xml_diff>
--- a/patents/cardanalysis_base/formal/word/01_权利要求书.docx
+++ b/patents/cardanalysis_base/formal/word/01_权利要求书.docx
@@ -614,7 +614,160 @@
           <w:rFonts w:ascii="宋体" w:hAnsi="宋体" w:eastAsia="宋体"/>
           <w:sz w:val="24"/>
         </w:rPr>
-        <w:t>23. 一种基于压缩语义空间的卡牌游戏内容设计评估系统，其特征在于，包括：</w:t>
+        <w:t>23. 根据权利要求1所述的方法，其特征在于，所述方法还包括构建用于评估流程编排的多关系约束图，所述多关系约束图包括能力节点、产物节点、决策节点和任务节点中的至少两种节点，并包括依赖边、提供边、消费边、冲突边、审核门控边和失效传播边中的至少三种边；其中，所述能力节点对应压缩语义投影、卡组结构分析、曲线分析、压力分析、候选差分评估、样本构造、学习排序或审计输出中的至少一种评估能力，所述产物节点对应压缩语义表示、卡组结构表示、曲线表示、结构缺口表示、压力语义表示、候选贡献表示、风险表示或可审计报告中的至少一种中间产物。</w:t>
+      </w:r>
+    </w:p>
+    <w:p>
+      <w:pPr>
+        <w:spacing w:before="0" w:after="120" w:line="360" w:lineRule="auto"/>
+      </w:pPr>
+      <w:r>
+        <w:rPr>
+          <w:rFonts w:ascii="宋体" w:hAnsi="宋体" w:eastAsia="宋体"/>
+          <w:sz w:val="24"/>
+        </w:rPr>
+        <w:t>24. 根据权利要求23所述的方法，其特征在于，所述方法还包括对所述多关系约束图执行一致性校验，所述一致性校验包括以下至少两种：</w:t>
+      </w:r>
+    </w:p>
+    <w:p>
+      <w:pPr>
+        <w:spacing w:before="0" w:after="120" w:line="360" w:lineRule="auto"/>
+        <w:ind w:firstLine="480"/>
+      </w:pPr>
+      <w:r>
+        <w:rPr>
+          <w:rFonts w:ascii="宋体" w:hAnsi="宋体" w:eastAsia="宋体"/>
+          <w:sz w:val="24"/>
+        </w:rPr>
+        <w:t>校验同一产物节点是否具有唯一提供者；</w:t>
+      </w:r>
+    </w:p>
+    <w:p>
+      <w:pPr>
+        <w:spacing w:before="0" w:after="120" w:line="360" w:lineRule="auto"/>
+        <w:ind w:firstLine="480"/>
+      </w:pPr>
+      <w:r>
+        <w:rPr>
+          <w:rFonts w:ascii="宋体" w:hAnsi="宋体" w:eastAsia="宋体"/>
+          <w:sz w:val="24"/>
+        </w:rPr>
+        <w:t>校验依赖边是否形成循环依赖；</w:t>
+      </w:r>
+    </w:p>
+    <w:p>
+      <w:pPr>
+        <w:spacing w:before="0" w:after="120" w:line="360" w:lineRule="auto"/>
+        <w:ind w:firstLine="480"/>
+      </w:pPr>
+      <w:r>
+        <w:rPr>
+          <w:rFonts w:ascii="宋体" w:hAnsi="宋体" w:eastAsia="宋体"/>
+          <w:sz w:val="24"/>
+        </w:rPr>
+        <w:t>校验多个任务节点的写入范围是否重叠；</w:t>
+      </w:r>
+    </w:p>
+    <w:p>
+      <w:pPr>
+        <w:spacing w:before="0" w:after="120" w:line="360" w:lineRule="auto"/>
+        <w:ind w:firstLine="480"/>
+      </w:pPr>
+      <w:r>
+        <w:rPr>
+          <w:rFonts w:ascii="宋体" w:hAnsi="宋体" w:eastAsia="宋体"/>
+          <w:sz w:val="24"/>
+        </w:rPr>
+        <w:t>校验冲突边是否阻止对应任务节点并行执行；</w:t>
+      </w:r>
+    </w:p>
+    <w:p>
+      <w:pPr>
+        <w:spacing w:before="0" w:after="120" w:line="360" w:lineRule="auto"/>
+        <w:ind w:firstLine="480"/>
+      </w:pPr>
+      <w:r>
+        <w:rPr>
+          <w:rFonts w:ascii="宋体" w:hAnsi="宋体" w:eastAsia="宋体"/>
+          <w:sz w:val="24"/>
+        </w:rPr>
+        <w:t>校验任务节点是否越过预设的人工审核边界、报告边界、学习排序启用边界或候选内容发布边界。</w:t>
+      </w:r>
+    </w:p>
+    <w:p>
+      <w:pPr>
+        <w:spacing w:before="0" w:after="120" w:line="360" w:lineRule="auto"/>
+      </w:pPr>
+      <w:r>
+        <w:rPr>
+          <w:rFonts w:ascii="宋体" w:hAnsi="宋体" w:eastAsia="宋体"/>
+          <w:sz w:val="24"/>
+        </w:rPr>
+        <w:t>25. 根据权利要求23所述的方法，其特征在于，所述方法还包括：</w:t>
+      </w:r>
+    </w:p>
+    <w:p>
+      <w:pPr>
+        <w:spacing w:before="0" w:after="120" w:line="360" w:lineRule="auto"/>
+        <w:ind w:firstLine="480"/>
+      </w:pPr>
+      <w:r>
+        <w:rPr>
+          <w:rFonts w:ascii="宋体" w:hAnsi="宋体" w:eastAsia="宋体"/>
+          <w:sz w:val="24"/>
+        </w:rPr>
+        <w:t>响应于能力节点、产物节点、决策节点或任务节点中的任一节点发生变化，沿所述提供边、消费边、依赖边、审核门控边或失效传播边中的至少两种生成影响范围表示；</w:t>
+      </w:r>
+    </w:p>
+    <w:p>
+      <w:pPr>
+        <w:spacing w:before="0" w:after="120" w:line="360" w:lineRule="auto"/>
+        <w:ind w:firstLine="480"/>
+      </w:pPr>
+      <w:r>
+        <w:rPr>
+          <w:rFonts w:ascii="宋体" w:hAnsi="宋体" w:eastAsia="宋体"/>
+          <w:sz w:val="24"/>
+        </w:rPr>
+        <w:t>根据所述影响范围表示生成需要重新计算、重新审核或重新输出的评估模块集合；</w:t>
+      </w:r>
+    </w:p>
+    <w:p>
+      <w:pPr>
+        <w:spacing w:before="0" w:after="120" w:line="360" w:lineRule="auto"/>
+        <w:ind w:firstLine="480"/>
+      </w:pPr>
+      <w:r>
+        <w:rPr>
+          <w:rFonts w:ascii="宋体" w:hAnsi="宋体" w:eastAsia="宋体"/>
+          <w:sz w:val="24"/>
+        </w:rPr>
+        <w:t>对多个候选任务节点执行并行安全检查，并根据所述并行安全检查输出硬冲突、软冲突、写入范围重叠、审核门控对象或任务交接对象中的至少一种；</w:t>
+      </w:r>
+    </w:p>
+    <w:p>
+      <w:pPr>
+        <w:spacing w:before="0" w:after="120" w:line="360" w:lineRule="auto"/>
+        <w:ind w:firstLine="480"/>
+      </w:pPr>
+      <w:r>
+        <w:rPr>
+          <w:rFonts w:ascii="宋体" w:hAnsi="宋体" w:eastAsia="宋体"/>
+          <w:sz w:val="24"/>
+        </w:rPr>
+        <w:t>将所述影响范围表示或并行安全检查结果写入所述可审计报告。</w:t>
+      </w:r>
+    </w:p>
+    <w:p>
+      <w:pPr>
+        <w:spacing w:before="0" w:after="120" w:line="360" w:lineRule="auto"/>
+      </w:pPr>
+      <w:r>
+        <w:rPr>
+          <w:rFonts w:ascii="宋体" w:hAnsi="宋体" w:eastAsia="宋体"/>
+          <w:sz w:val="24"/>
+        </w:rPr>
+        <w:t>26. 一种基于压缩语义空间的卡牌游戏内容设计评估系统，其特征在于，包括：</w:t>
       </w:r>
     </w:p>
     <w:p>
@@ -730,7 +883,19 @@
           <w:rFonts w:ascii="宋体" w:hAnsi="宋体" w:eastAsia="宋体"/>
           <w:sz w:val="24"/>
         </w:rPr>
-        <w:t>24. 根据权利要求23所述的系统，其特征在于，所述系统还包括样本构造模块和学习排序模块；</w:t>
+        <w:t>27. 根据权利要求26所述的系统，其特征在于，所述系统还包括多关系约束图编排模块，所述多关系约束图编排模块用于生成包括能力节点、产物节点、决策节点和任务节点中的至少两种节点的多关系约束图，并基于所述多关系约束图执行一致性校验、影响范围分析、并行安全检查或审核门控检查中的至少一种。</w:t>
+      </w:r>
+    </w:p>
+    <w:p>
+      <w:pPr>
+        <w:spacing w:before="0" w:after="120" w:line="360" w:lineRule="auto"/>
+      </w:pPr>
+      <w:r>
+        <w:rPr>
+          <w:rFonts w:ascii="宋体" w:hAnsi="宋体" w:eastAsia="宋体"/>
+          <w:sz w:val="24"/>
+        </w:rPr>
+        <w:t>28. 根据权利要求26所述的系统，其特征在于，所述系统还包括样本构造模块和学习排序模块；</w:t>
       </w:r>
     </w:p>
     <w:p>
@@ -768,7 +933,7 @@
           <w:rFonts w:ascii="宋体" w:hAnsi="宋体" w:eastAsia="宋体"/>
           <w:sz w:val="24"/>
         </w:rPr>
-        <w:t>25. 一种电子设备，包括处理器和存储器，所述存储器中存储有计算机程序，其特征在于，所述计算机程序被所述处理器执行时实现权利要求1至22中任一项所述的方法。</w:t>
+        <w:t>29. 一种电子设备，包括处理器和存储器，所述存储器中存储有计算机程序，其特征在于，所述计算机程序被所述处理器执行时实现权利要求1至25中任一项所述的方法。</w:t>
       </w:r>
     </w:p>
     <w:p>
@@ -780,7 +945,7 @@
           <w:rFonts w:ascii="宋体" w:hAnsi="宋体" w:eastAsia="宋体"/>
           <w:sz w:val="24"/>
         </w:rPr>
-        <w:t>26. 一种计算机可读存储介质，其上存储有计算机程序，其特征在于，所述计算机程序被处理器执行时实现权利要求1至22中任一项所述的方法。</w:t>
+        <w:t>30. 一种计算机可读存储介质，其上存储有计算机程序，其特征在于，所述计算机程序被处理器执行时实现权利要求1至25中任一项所述的方法。</w:t>
       </w:r>
     </w:p>
     <w:p>
@@ -792,7 +957,7 @@
           <w:rFonts w:ascii="宋体" w:hAnsi="宋体" w:eastAsia="宋体"/>
           <w:sz w:val="24"/>
         </w:rPr>
-        <w:t>27. 一种计算机程序产品，包括计算机程序或指令，其特征在于，所述计算机程序或指令被处理器执行时实现权利要求1至22中任一项所述的方法。</w:t>
+        <w:t>31. 一种计算机程序产品，包括计算机程序或指令，其特征在于，所述计算机程序或指令被处理器执行时实现权利要求1至25中任一项所述的方法。</w:t>
       </w:r>
     </w:p>
     <w:sectPr>

</xml_diff>